<commit_message>
Verify final Albor bilingual DOCX on native LibreOffice for candidate 9a6443a1
</commit_message>
<xml_diff>
--- a/qa/fixtures/albor-ronda15-en.docx
+++ b/qa/fixtures/albor-ronda15-en.docx
@@ -6934,7 +6934,27 @@
             <w:i w:val="0"/>
             <w:rStyle w:val="Hyperlink"/>
           </w:rPr>
-          <w:t>https://archive.albor.example/café/東京?label=Δ&amp;revision=ALB%2D015#revisión</w:t>
+          <w:t>https://archive.albor.example/café/</w:t>
+        </w:r>
+      </w:hyperlink>
+      <w:hyperlink r:id="rId16">
+        <w:r>
+          <w:rPr>
+            <w:b w:val="0"/>
+            <w:i w:val="0"/>
+            <w:rStyle w:val="Hyperlink"/>
+          </w:rPr>
+          <w:t>東京</w:t>
+        </w:r>
+      </w:hyperlink>
+      <w:hyperlink r:id="rId16">
+        <w:r>
+          <w:rPr>
+            <w:b w:val="0"/>
+            <w:i w:val="0"/>
+            <w:rStyle w:val="Hyperlink"/>
+          </w:rPr>
+          <w:t>?label=Δ&amp;revision=ALB%2D015#revisión</w:t>
         </w:r>
       </w:hyperlink>
     </w:p>

</xml_diff>